<commit_message>
update format lengkap perbaikan 4
</commit_message>
<xml_diff>
--- a/public/templates/6. ADNOC Medical Form.docx
+++ b/public/templates/6. ADNOC Medical Form.docx
@@ -250,12 +250,14 @@
         <w:gridCol w:w="1280"/>
         <w:gridCol w:w="578"/>
         <w:gridCol w:w="55"/>
-        <w:gridCol w:w="1222"/>
+        <w:gridCol w:w="1167"/>
+        <w:gridCol w:w="55"/>
         <w:gridCol w:w="282"/>
         <w:gridCol w:w="425"/>
         <w:gridCol w:w="49"/>
         <w:gridCol w:w="816"/>
-        <w:gridCol w:w="361"/>
+        <w:gridCol w:w="35"/>
+        <w:gridCol w:w="326"/>
         <w:gridCol w:w="192"/>
         <w:gridCol w:w="438"/>
         <w:gridCol w:w="271"/>
@@ -263,8 +265,9 @@
         <w:gridCol w:w="1115"/>
         <w:gridCol w:w="511"/>
         <w:gridCol w:w="164"/>
-        <w:gridCol w:w="648"/>
-        <w:gridCol w:w="720"/>
+        <w:gridCol w:w="649"/>
+        <w:gridCol w:w="721"/>
+        <w:gridCol w:w="6"/>
       </w:tblGrid>
       <w:tr>
         <w:trPr>
@@ -273,7 +276,7 @@
         <w:tc>
           <w:tcPr>
             <w:tcW w:w="9571" w:type="dxa"/>
-            <w:gridSpan w:val="18"/>
+            <w:gridSpan w:val="21"/>
           </w:tcPr>
           <w:p>
             <w:pPr>
@@ -500,7 +503,7 @@
         <w:tc>
           <w:tcPr>
             <w:tcW w:w="3135" w:type="dxa"/>
-            <w:gridSpan w:val="4"/>
+            <w:gridSpan w:val="5"/>
           </w:tcPr>
           <w:p>
             <w:pPr>
@@ -574,7 +577,7 @@
         <w:tc>
           <w:tcPr>
             <w:tcW w:w="3278" w:type="dxa"/>
-            <w:gridSpan w:val="9"/>
+            <w:gridSpan w:val="10"/>
           </w:tcPr>
           <w:p>
             <w:pPr>
@@ -648,7 +651,7 @@
         <w:tc>
           <w:tcPr>
             <w:tcW w:w="3158" w:type="dxa"/>
-            <w:gridSpan w:val="5"/>
+            <w:gridSpan w:val="6"/>
           </w:tcPr>
           <w:p>
             <w:pPr>
@@ -727,7 +730,7 @@
         <w:tc>
           <w:tcPr>
             <w:tcW w:w="3135" w:type="dxa"/>
-            <w:gridSpan w:val="4"/>
+            <w:gridSpan w:val="5"/>
           </w:tcPr>
           <w:p>
             <w:pPr>
@@ -790,7 +793,7 @@
         <w:tc>
           <w:tcPr>
             <w:tcW w:w="3278" w:type="dxa"/>
-            <w:gridSpan w:val="9"/>
+            <w:gridSpan w:val="10"/>
           </w:tcPr>
           <w:p>
             <w:pPr>
@@ -827,7 +830,7 @@
         <w:tc>
           <w:tcPr>
             <w:tcW w:w="3158" w:type="dxa"/>
-            <w:gridSpan w:val="5"/>
+            <w:gridSpan w:val="6"/>
           </w:tcPr>
           <w:p>
             <w:pPr>
@@ -869,7 +872,7 @@
         <w:tc>
           <w:tcPr>
             <w:tcW w:w="3135" w:type="dxa"/>
-            <w:gridSpan w:val="4"/>
+            <w:gridSpan w:val="5"/>
           </w:tcPr>
           <w:p>
             <w:pPr>
@@ -906,7 +909,7 @@
         <w:tc>
           <w:tcPr>
             <w:tcW w:w="3278" w:type="dxa"/>
-            <w:gridSpan w:val="9"/>
+            <w:gridSpan w:val="10"/>
           </w:tcPr>
           <w:p>
             <w:pPr>
@@ -956,7 +959,7 @@
         <w:tc>
           <w:tcPr>
             <w:tcW w:w="3158" w:type="dxa"/>
-            <w:gridSpan w:val="5"/>
+            <w:gridSpan w:val="6"/>
           </w:tcPr>
           <w:p>
             <w:pPr>
@@ -1027,7 +1030,7 @@
         <w:tc>
           <w:tcPr>
             <w:tcW w:w="3135" w:type="dxa"/>
-            <w:gridSpan w:val="4"/>
+            <w:gridSpan w:val="5"/>
           </w:tcPr>
           <w:p>
             <w:pPr>
@@ -1120,7 +1123,7 @@
         <w:tc>
           <w:tcPr>
             <w:tcW w:w="3278" w:type="dxa"/>
-            <w:gridSpan w:val="9"/>
+            <w:gridSpan w:val="10"/>
           </w:tcPr>
           <w:p>
             <w:pPr>
@@ -1157,7 +1160,7 @@
         <w:tc>
           <w:tcPr>
             <w:tcW w:w="3158" w:type="dxa"/>
-            <w:gridSpan w:val="5"/>
+            <w:gridSpan w:val="6"/>
           </w:tcPr>
           <w:p>
             <w:pPr>
@@ -1241,7 +1244,7 @@
         <w:tc>
           <w:tcPr>
             <w:tcW w:w="9571" w:type="dxa"/>
-            <w:gridSpan w:val="18"/>
+            <w:gridSpan w:val="21"/>
             <w:shd w:val="clear" w:color="auto" w:fill="D9D9D9"/>
           </w:tcPr>
           <w:p>
@@ -1287,7 +1290,7 @@
         <w:tc>
           <w:tcPr>
             <w:tcW w:w="3135" w:type="dxa"/>
-            <w:gridSpan w:val="4"/>
+            <w:gridSpan w:val="5"/>
           </w:tcPr>
           <w:p>
             <w:pPr>
@@ -1310,7 +1313,7 @@
         <w:tc>
           <w:tcPr>
             <w:tcW w:w="3278" w:type="dxa"/>
-            <w:gridSpan w:val="9"/>
+            <w:gridSpan w:val="10"/>
           </w:tcPr>
           <w:p>
             <w:pPr>
@@ -1369,7 +1372,7 @@
         <w:tc>
           <w:tcPr>
             <w:tcW w:w="1532" w:type="dxa"/>
-            <w:gridSpan w:val="3"/>
+            <w:gridSpan w:val="4"/>
           </w:tcPr>
           <w:p>
             <w:pPr>
@@ -1410,7 +1413,7 @@
         <w:tc>
           <w:tcPr>
             <w:tcW w:w="3135" w:type="dxa"/>
-            <w:gridSpan w:val="4"/>
+            <w:gridSpan w:val="5"/>
           </w:tcPr>
           <w:p>
             <w:pPr>
@@ -1435,7 +1438,7 @@
         <w:tc>
           <w:tcPr>
             <w:tcW w:w="3278" w:type="dxa"/>
-            <w:gridSpan w:val="9"/>
+            <w:gridSpan w:val="10"/>
           </w:tcPr>
           <w:p>
             <w:pPr>
@@ -1481,7 +1484,7 @@
         <w:tc>
           <w:tcPr>
             <w:tcW w:w="1532" w:type="dxa"/>
-            <w:gridSpan w:val="3"/>
+            <w:gridSpan w:val="4"/>
           </w:tcPr>
           <w:p>
             <w:pPr>
@@ -1509,7 +1512,7 @@
         <w:tc>
           <w:tcPr>
             <w:tcW w:w="3135" w:type="dxa"/>
-            <w:gridSpan w:val="4"/>
+            <w:gridSpan w:val="5"/>
           </w:tcPr>
           <w:p>
             <w:pPr>
@@ -1546,7 +1549,7 @@
         <w:tc>
           <w:tcPr>
             <w:tcW w:w="3278" w:type="dxa"/>
-            <w:gridSpan w:val="9"/>
+            <w:gridSpan w:val="10"/>
           </w:tcPr>
           <w:p>
             <w:pPr>
@@ -1620,7 +1623,7 @@
         <w:tc>
           <w:tcPr>
             <w:tcW w:w="1532" w:type="dxa"/>
-            <w:gridSpan w:val="3"/>
+            <w:gridSpan w:val="4"/>
           </w:tcPr>
           <w:p>
             <w:pPr>
@@ -1662,7 +1665,7 @@
         <w:tc>
           <w:tcPr>
             <w:tcW w:w="3135" w:type="dxa"/>
-            <w:gridSpan w:val="4"/>
+            <w:gridSpan w:val="5"/>
           </w:tcPr>
           <w:p>
             <w:pPr>
@@ -1699,7 +1702,7 @@
         <w:tc>
           <w:tcPr>
             <w:tcW w:w="3278" w:type="dxa"/>
-            <w:gridSpan w:val="9"/>
+            <w:gridSpan w:val="10"/>
           </w:tcPr>
           <w:p>
             <w:pPr>
@@ -1773,7 +1776,7 @@
         <w:tc>
           <w:tcPr>
             <w:tcW w:w="1532" w:type="dxa"/>
-            <w:gridSpan w:val="3"/>
+            <w:gridSpan w:val="4"/>
           </w:tcPr>
           <w:p>
             <w:pPr>
@@ -1815,7 +1818,7 @@
         <w:tc>
           <w:tcPr>
             <w:tcW w:w="3135" w:type="dxa"/>
-            <w:gridSpan w:val="4"/>
+            <w:gridSpan w:val="5"/>
           </w:tcPr>
           <w:p>
             <w:pPr>
@@ -1852,7 +1855,7 @@
         <w:tc>
           <w:tcPr>
             <w:tcW w:w="3278" w:type="dxa"/>
-            <w:gridSpan w:val="9"/>
+            <w:gridSpan w:val="10"/>
           </w:tcPr>
           <w:p>
             <w:pPr>
@@ -1926,7 +1929,7 @@
         <w:tc>
           <w:tcPr>
             <w:tcW w:w="1532" w:type="dxa"/>
-            <w:gridSpan w:val="3"/>
+            <w:gridSpan w:val="4"/>
           </w:tcPr>
           <w:p>
             <w:pPr>
@@ -1968,7 +1971,7 @@
         <w:tc>
           <w:tcPr>
             <w:tcW w:w="9571" w:type="dxa"/>
-            <w:gridSpan w:val="18"/>
+            <w:gridSpan w:val="21"/>
             <w:shd w:val="clear" w:color="auto" w:fill="D9D9D9"/>
           </w:tcPr>
           <w:p>
@@ -2014,7 +2017,7 @@
         <w:tc>
           <w:tcPr>
             <w:tcW w:w="9571" w:type="dxa"/>
-            <w:gridSpan w:val="18"/>
+            <w:gridSpan w:val="21"/>
             <w:tcBorders>
               <w:bottom w:val="nil"/>
             </w:tcBorders>
@@ -2097,7 +2100,7 @@
         <w:tc>
           <w:tcPr>
             <w:tcW w:w="1984" w:type="dxa"/>
-            <w:gridSpan w:val="4"/>
+            <w:gridSpan w:val="5"/>
             <w:tcBorders>
               <w:top w:val="nil"/>
               <w:left w:val="nil"/>
@@ -2154,7 +2157,7 @@
         <w:tc>
           <w:tcPr>
             <w:tcW w:w="2127" w:type="dxa"/>
-            <w:gridSpan w:val="6"/>
+            <w:gridSpan w:val="7"/>
             <w:tcBorders>
               <w:top w:val="nil"/>
               <w:left w:val="nil"/>
@@ -2211,7 +2214,7 @@
         <w:tc>
           <w:tcPr>
             <w:tcW w:w="3602" w:type="dxa"/>
-            <w:gridSpan w:val="6"/>
+            <w:gridSpan w:val="7"/>
             <w:tcBorders>
               <w:top w:val="nil"/>
               <w:left w:val="nil"/>
@@ -2328,7 +2331,7 @@
         <w:tc>
           <w:tcPr>
             <w:tcW w:w="1984" w:type="dxa"/>
-            <w:gridSpan w:val="4"/>
+            <w:gridSpan w:val="5"/>
             <w:tcBorders>
               <w:top w:val="nil"/>
               <w:left w:val="nil"/>
@@ -2385,7 +2388,7 @@
         <w:tc>
           <w:tcPr>
             <w:tcW w:w="2127" w:type="dxa"/>
-            <w:gridSpan w:val="6"/>
+            <w:gridSpan w:val="7"/>
             <w:tcBorders>
               <w:top w:val="nil"/>
               <w:left w:val="nil"/>
@@ -2442,7 +2445,7 @@
         <w:tc>
           <w:tcPr>
             <w:tcW w:w="3602" w:type="dxa"/>
-            <w:gridSpan w:val="6"/>
+            <w:gridSpan w:val="7"/>
             <w:tcBorders>
               <w:top w:val="nil"/>
               <w:left w:val="nil"/>
@@ -2503,7 +2506,7 @@
         <w:tc>
           <w:tcPr>
             <w:tcW w:w="9571" w:type="dxa"/>
-            <w:gridSpan w:val="18"/>
+            <w:gridSpan w:val="21"/>
             <w:tcBorders>
               <w:top w:val="nil"/>
             </w:tcBorders>
@@ -2600,7 +2603,7 @@
         <w:tc>
           <w:tcPr>
             <w:tcW w:w="9571" w:type="dxa"/>
-            <w:gridSpan w:val="18"/>
+            <w:gridSpan w:val="21"/>
             <w:shd w:val="clear" w:color="auto" w:fill="D9D9D9"/>
           </w:tcPr>
           <w:p>
@@ -2646,7 +2649,7 @@
         <w:tc>
           <w:tcPr>
             <w:tcW w:w="9571" w:type="dxa"/>
-            <w:gridSpan w:val="18"/>
+            <w:gridSpan w:val="21"/>
           </w:tcPr>
           <w:p>
             <w:pPr>
@@ -2763,7 +2766,7 @@
         <w:tc>
           <w:tcPr>
             <w:tcW w:w="1559" w:type="dxa"/>
-            <w:gridSpan w:val="3"/>
+            <w:gridSpan w:val="4"/>
           </w:tcPr>
           <w:p>
             <w:pPr>
@@ -2816,7 +2819,7 @@
         <w:tc>
           <w:tcPr>
             <w:tcW w:w="1843" w:type="dxa"/>
-            <w:gridSpan w:val="5"/>
+            <w:gridSpan w:val="6"/>
           </w:tcPr>
           <w:p>
             <w:pPr>
@@ -2922,7 +2925,7 @@
         <w:tc>
           <w:tcPr>
             <w:tcW w:w="2043" w:type="dxa"/>
-            <w:gridSpan w:val="4"/>
+            <w:gridSpan w:val="5"/>
           </w:tcPr>
           <w:p>
             <w:pPr>
@@ -3035,7 +3038,7 @@
         <w:tc>
           <w:tcPr>
             <w:tcW w:w="1559" w:type="dxa"/>
-            <w:gridSpan w:val="3"/>
+            <w:gridSpan w:val="4"/>
           </w:tcPr>
           <w:p>
             <w:pPr>
@@ -3088,7 +3091,7 @@
         <w:tc>
           <w:tcPr>
             <w:tcW w:w="1843" w:type="dxa"/>
-            <w:gridSpan w:val="5"/>
+            <w:gridSpan w:val="6"/>
           </w:tcPr>
           <w:p>
             <w:pPr>
@@ -3141,7 +3144,7 @@
         <w:tc>
           <w:tcPr>
             <w:tcW w:w="4311" w:type="dxa"/>
-            <w:gridSpan w:val="8"/>
+            <w:gridSpan w:val="9"/>
           </w:tcPr>
           <w:p>
             <w:pPr>
@@ -3266,7 +3269,7 @@
         <w:tc>
           <w:tcPr>
             <w:tcW w:w="2794" w:type="dxa"/>
-            <w:gridSpan w:val="5"/>
+            <w:gridSpan w:val="6"/>
           </w:tcPr>
           <w:p>
             <w:pPr>
@@ -3390,7 +3393,7 @@
         <w:tc>
           <w:tcPr>
             <w:tcW w:w="991" w:type="dxa"/>
-            <w:gridSpan w:val="3"/>
+            <w:gridSpan w:val="4"/>
           </w:tcPr>
           <w:p>
             <w:pPr>
@@ -3432,7 +3435,7 @@
         <w:tc>
           <w:tcPr>
             <w:tcW w:w="3158" w:type="dxa"/>
-            <w:gridSpan w:val="5"/>
+            <w:gridSpan w:val="6"/>
           </w:tcPr>
           <w:p>
             <w:pPr>
@@ -3622,7 +3625,7 @@
         <w:tc>
           <w:tcPr>
             <w:tcW w:w="2794" w:type="dxa"/>
-            <w:gridSpan w:val="5"/>
+            <w:gridSpan w:val="6"/>
           </w:tcPr>
           <w:p>
             <w:pPr>
@@ -3661,7 +3664,7 @@
         <w:tc>
           <w:tcPr>
             <w:tcW w:w="991" w:type="dxa"/>
-            <w:gridSpan w:val="3"/>
+            <w:gridSpan w:val="4"/>
           </w:tcPr>
           <w:p>
             <w:pPr>
@@ -3753,7 +3756,7 @@
         <w:tc>
           <w:tcPr>
             <w:tcW w:w="3158" w:type="dxa"/>
-            <w:gridSpan w:val="5"/>
+            <w:gridSpan w:val="6"/>
           </w:tcPr>
           <w:p>
             <w:pPr>
@@ -3858,7 +3861,7 @@
         <w:tc>
           <w:tcPr>
             <w:tcW w:w="2794" w:type="dxa"/>
-            <w:gridSpan w:val="5"/>
+            <w:gridSpan w:val="6"/>
           </w:tcPr>
           <w:p>
             <w:pPr>
@@ -3897,7 +3900,7 @@
         <w:tc>
           <w:tcPr>
             <w:tcW w:w="991" w:type="dxa"/>
-            <w:gridSpan w:val="3"/>
+            <w:gridSpan w:val="4"/>
             <w:vMerge w:val="restart"/>
           </w:tcPr>
           <w:p>
@@ -3961,7 +3964,7 @@
         <w:tc>
           <w:tcPr>
             <w:tcW w:w="3158" w:type="dxa"/>
-            <w:gridSpan w:val="5"/>
+            <w:gridSpan w:val="6"/>
             <w:vMerge w:val="restart"/>
           </w:tcPr>
           <w:p>
@@ -4067,7 +4070,7 @@
         <w:tc>
           <w:tcPr>
             <w:tcW w:w="2794" w:type="dxa"/>
-            <w:gridSpan w:val="5"/>
+            <w:gridSpan w:val="6"/>
           </w:tcPr>
           <w:p>
             <w:pPr>
@@ -4106,7 +4109,7 @@
         <w:tc>
           <w:tcPr>
             <w:tcW w:w="991" w:type="dxa"/>
-            <w:gridSpan w:val="3"/>
+            <w:gridSpan w:val="4"/>
             <w:vMerge/>
             <w:tcBorders>
               <w:top w:val="nil"/>
@@ -4142,7 +4145,7 @@
         <w:tc>
           <w:tcPr>
             <w:tcW w:w="3158" w:type="dxa"/>
-            <w:gridSpan w:val="5"/>
+            <w:gridSpan w:val="6"/>
             <w:vMerge/>
             <w:tcBorders>
               <w:top w:val="nil"/>
@@ -4165,7 +4168,7 @@
         <w:tc>
           <w:tcPr>
             <w:tcW w:w="9571" w:type="dxa"/>
-            <w:gridSpan w:val="18"/>
+            <w:gridSpan w:val="21"/>
             <w:shd w:val="clear" w:color="auto" w:fill="D9D9D9"/>
           </w:tcPr>
           <w:p>
@@ -4211,7 +4214,7 @@
         <w:tc>
           <w:tcPr>
             <w:tcW w:w="3135" w:type="dxa"/>
-            <w:gridSpan w:val="4"/>
+            <w:gridSpan w:val="5"/>
           </w:tcPr>
           <w:p>
             <w:pPr>
@@ -4461,6 +4464,7 @@
         <w:tc>
           <w:tcPr>
             <w:tcW w:w="361" w:type="dxa"/>
+            <w:gridSpan w:val="2"/>
             <w:vMerge w:val="restart"/>
             <w:shd w:val="clear" w:color="auto" w:fill="BEBEBE"/>
           </w:tcPr>
@@ -4702,6 +4706,7 @@
         <w:tc>
           <w:tcPr>
             <w:tcW w:w="720" w:type="dxa"/>
+            <w:gridSpan w:val="2"/>
           </w:tcPr>
           <w:p>
             <w:pPr>
@@ -4731,7 +4736,7 @@
         <w:tc>
           <w:tcPr>
             <w:tcW w:w="3135" w:type="dxa"/>
-            <w:gridSpan w:val="4"/>
+            <w:gridSpan w:val="5"/>
           </w:tcPr>
           <w:p>
             <w:pPr>
@@ -4805,7 +4810,15 @@
                 <w:rFonts w:ascii="Times New Roman"/>
                 <w:sz w:val="20"/>
               </w:rPr>
-              <w:t>ph_hbp_y</w:t>
+              <w:t>ph_hb</w:t>
+            </w:r>
+            <w:r>
+              <w:rPr>
+                <w:rFonts w:ascii="Times New Roman"/>
+                <w:sz w:val="20"/>
+              </w:rPr>
+              <w:lastRenderedPageBreak/>
+              <w:t>p_y</w:t>
             </w:r>
             <w:proofErr w:type="spellEnd"/>
             <w:r>
@@ -4836,6 +4849,7 @@
                 <w:rFonts w:ascii="Times New Roman"/>
                 <w:sz w:val="20"/>
               </w:rPr>
+              <w:lastRenderedPageBreak/>
               <w:t>{{</w:t>
             </w:r>
             <w:proofErr w:type="spellStart"/>
@@ -4844,7 +4858,15 @@
                 <w:rFonts w:ascii="Times New Roman"/>
                 <w:sz w:val="20"/>
               </w:rPr>
-              <w:t>ph_hbp_</w:t>
+              <w:t>ph_hbp</w:t>
+            </w:r>
+            <w:r>
+              <w:rPr>
+                <w:rFonts w:ascii="Times New Roman"/>
+                <w:sz w:val="20"/>
+              </w:rPr>
+              <w:lastRenderedPageBreak/>
+              <w:t>_</w:t>
             </w:r>
             <w:r>
               <w:rPr>
@@ -4866,6 +4888,7 @@
         <w:tc>
           <w:tcPr>
             <w:tcW w:w="361" w:type="dxa"/>
+            <w:gridSpan w:val="2"/>
             <w:vMerge/>
             <w:tcBorders>
               <w:top w:val="nil"/>
@@ -4944,7 +4967,15 @@
                 <w:rFonts w:ascii="Times New Roman"/>
                 <w:sz w:val="20"/>
               </w:rPr>
-              <w:t>ph_kid_y</w:t>
+              <w:t>ph_k</w:t>
+            </w:r>
+            <w:r>
+              <w:rPr>
+                <w:rFonts w:ascii="Times New Roman"/>
+                <w:sz w:val="20"/>
+              </w:rPr>
+              <w:lastRenderedPageBreak/>
+              <w:t>id_y</w:t>
             </w:r>
             <w:proofErr w:type="spellEnd"/>
             <w:r>
@@ -4959,6 +4990,7 @@
         <w:tc>
           <w:tcPr>
             <w:tcW w:w="720" w:type="dxa"/>
+            <w:gridSpan w:val="2"/>
             <w:vAlign w:val="center"/>
           </w:tcPr>
           <w:p>
@@ -4975,6 +5007,7 @@
                 <w:rFonts w:ascii="Times New Roman"/>
                 <w:sz w:val="20"/>
               </w:rPr>
+              <w:lastRenderedPageBreak/>
               <w:t>{{</w:t>
             </w:r>
             <w:proofErr w:type="spellStart"/>
@@ -4983,7 +5016,15 @@
                 <w:rFonts w:ascii="Times New Roman"/>
                 <w:sz w:val="20"/>
               </w:rPr>
-              <w:t>ph_kid_</w:t>
+              <w:t>ph_ki</w:t>
+            </w:r>
+            <w:r>
+              <w:rPr>
+                <w:rFonts w:ascii="Times New Roman"/>
+                <w:sz w:val="20"/>
+              </w:rPr>
+              <w:lastRenderedPageBreak/>
+              <w:t>d_</w:t>
             </w:r>
             <w:r>
               <w:rPr>
@@ -5010,7 +5051,7 @@
         <w:tc>
           <w:tcPr>
             <w:tcW w:w="3135" w:type="dxa"/>
-            <w:gridSpan w:val="4"/>
+            <w:gridSpan w:val="5"/>
           </w:tcPr>
           <w:p>
             <w:pPr>
@@ -5025,6 +5066,7 @@
               <w:rPr>
                 <w:sz w:val="20"/>
               </w:rPr>
+              <w:lastRenderedPageBreak/>
               <w:t>Angina</w:t>
             </w:r>
             <w:r>
@@ -5145,6 +5187,7 @@
         <w:tc>
           <w:tcPr>
             <w:tcW w:w="361" w:type="dxa"/>
+            <w:gridSpan w:val="2"/>
             <w:vMerge/>
             <w:tcBorders>
               <w:top w:val="nil"/>
@@ -5238,6 +5281,7 @@
         <w:tc>
           <w:tcPr>
             <w:tcW w:w="720" w:type="dxa"/>
+            <w:gridSpan w:val="2"/>
             <w:vAlign w:val="center"/>
           </w:tcPr>
           <w:p>
@@ -5289,7 +5333,7 @@
         <w:tc>
           <w:tcPr>
             <w:tcW w:w="3135" w:type="dxa"/>
-            <w:gridSpan w:val="4"/>
+            <w:gridSpan w:val="5"/>
           </w:tcPr>
           <w:p>
             <w:pPr>
@@ -5304,7 +5348,6 @@
               <w:rPr>
                 <w:sz w:val="20"/>
               </w:rPr>
-              <w:lastRenderedPageBreak/>
               <w:t>Heart</w:t>
             </w:r>
             <w:r>
@@ -5412,6 +5455,7 @@
         <w:tc>
           <w:tcPr>
             <w:tcW w:w="361" w:type="dxa"/>
+            <w:gridSpan w:val="2"/>
             <w:vMerge/>
             <w:tcBorders>
               <w:top w:val="nil"/>
@@ -5503,6 +5547,7 @@
         <w:tc>
           <w:tcPr>
             <w:tcW w:w="720" w:type="dxa"/>
+            <w:gridSpan w:val="2"/>
             <w:vAlign w:val="center"/>
           </w:tcPr>
           <w:p>
@@ -5554,7 +5599,7 @@
         <w:tc>
           <w:tcPr>
             <w:tcW w:w="3135" w:type="dxa"/>
-            <w:gridSpan w:val="4"/>
+            <w:gridSpan w:val="5"/>
           </w:tcPr>
           <w:p>
             <w:pPr>
@@ -5676,6 +5721,7 @@
         <w:tc>
           <w:tcPr>
             <w:tcW w:w="361" w:type="dxa"/>
+            <w:gridSpan w:val="2"/>
             <w:vMerge/>
             <w:tcBorders>
               <w:top w:val="nil"/>
@@ -5806,6 +5852,7 @@
         <w:tc>
           <w:tcPr>
             <w:tcW w:w="720" w:type="dxa"/>
+            <w:gridSpan w:val="2"/>
             <w:vAlign w:val="center"/>
           </w:tcPr>
           <w:p>
@@ -5850,116 +5897,16 @@
           </w:p>
         </w:tc>
       </w:tr>
-    </w:tbl>
-    <w:p>
-      <w:pPr>
-        <w:tabs>
-          <w:tab w:val="left" w:pos="7486"/>
-        </w:tabs>
-        <w:spacing w:before="170"/>
-        <w:ind w:left="127"/>
-        <w:rPr>
-          <w:sz w:val="18"/>
-        </w:rPr>
-      </w:pPr>
-      <w:r>
-        <w:rPr>
-          <w:sz w:val="18"/>
-        </w:rPr>
-        <w:t>Page</w:t>
-      </w:r>
-      <w:r>
-        <w:rPr>
-          <w:spacing w:val="-1"/>
-          <w:sz w:val="18"/>
-        </w:rPr>
-        <w:t xml:space="preserve"> </w:t>
-      </w:r>
-      <w:r>
-        <w:rPr>
-          <w:b/>
-          <w:sz w:val="18"/>
-        </w:rPr>
-        <w:t xml:space="preserve">1 </w:t>
-      </w:r>
-      <w:r>
-        <w:rPr>
-          <w:sz w:val="18"/>
-        </w:rPr>
-        <w:t xml:space="preserve">of </w:t>
-      </w:r>
-      <w:r>
-        <w:rPr>
-          <w:b/>
-          <w:spacing w:val="-10"/>
-          <w:sz w:val="18"/>
-        </w:rPr>
-        <w:t>2</w:t>
-      </w:r>
-      <w:r>
-        <w:rPr>
-          <w:b/>
-          <w:sz w:val="18"/>
-        </w:rPr>
-        <w:tab/>
-      </w:r>
-      <w:r>
-        <w:rPr>
-          <w:spacing w:val="-2"/>
-          <w:sz w:val="18"/>
-        </w:rPr>
-        <w:t>MSU/QRM/OHU/ARQ/1.1/16</w:t>
-      </w:r>
-    </w:p>
-    <w:p>
-      <w:pPr>
-        <w:rPr>
-          <w:sz w:val="18"/>
-        </w:rPr>
-        <w:sectPr>
-          <w:footerReference w:type="default" r:id="rId9"/>
-          <w:type w:val="continuous"/>
-          <w:pgSz w:w="11910" w:h="16840"/>
-          <w:pgMar w:top="260" w:right="992" w:bottom="280" w:left="1133" w:header="720" w:footer="720" w:gutter="0"/>
-          <w:cols w:space="720"/>
-        </w:sectPr>
-      </w:pPr>
-    </w:p>
-    <w:tbl>
-      <w:tblPr>
-        <w:tblW w:w="0" w:type="auto"/>
-        <w:tblInd w:w="132" w:type="dxa"/>
-        <w:tblBorders>
-          <w:top w:val="single" w:sz="4" w:space="0" w:color="000000"/>
-          <w:left w:val="single" w:sz="4" w:space="0" w:color="000000"/>
-          <w:bottom w:val="single" w:sz="4" w:space="0" w:color="000000"/>
-          <w:right w:val="single" w:sz="4" w:space="0" w:color="000000"/>
-          <w:insideH w:val="single" w:sz="4" w:space="0" w:color="000000"/>
-          <w:insideV w:val="single" w:sz="4" w:space="0" w:color="000000"/>
-        </w:tblBorders>
-        <w:tblLayout w:type="fixed"/>
-        <w:tblCellMar>
-          <w:left w:w="0" w:type="dxa"/>
-          <w:right w:w="0" w:type="dxa"/>
-        </w:tblCellMar>
-        <w:tblLook w:val="01E0" w:firstRow="1" w:lastRow="1" w:firstColumn="1" w:lastColumn="1" w:noHBand="0" w:noVBand="0"/>
-      </w:tblPr>
-      <w:tblGrid>
-        <w:gridCol w:w="3080"/>
-        <w:gridCol w:w="809"/>
-        <w:gridCol w:w="851"/>
-        <w:gridCol w:w="321"/>
-        <w:gridCol w:w="3134"/>
-        <w:gridCol w:w="649"/>
-        <w:gridCol w:w="721"/>
-      </w:tblGrid>
       <w:tr>
         <w:trPr>
+          <w:gridAfter w:val="1"/>
+          <w:wAfter w:w="6" w:type="dxa"/>
           <w:trHeight w:val="710"/>
         </w:trPr>
         <w:tc>
           <w:tcPr>
             <w:tcW w:w="3080" w:type="dxa"/>
+            <w:gridSpan w:val="4"/>
           </w:tcPr>
           <w:p>
             <w:pPr>
@@ -5978,7 +5925,6 @@
                 <w:i/>
                 <w:sz w:val="20"/>
               </w:rPr>
-              <w:lastRenderedPageBreak/>
               <w:t>Do</w:t>
             </w:r>
             <w:r>
@@ -6105,6 +6051,7 @@
         <w:tc>
           <w:tcPr>
             <w:tcW w:w="809" w:type="dxa"/>
+            <w:gridSpan w:val="4"/>
           </w:tcPr>
           <w:p>
             <w:pPr>
@@ -6129,6 +6076,7 @@
         <w:tc>
           <w:tcPr>
             <w:tcW w:w="851" w:type="dxa"/>
+            <w:gridSpan w:val="2"/>
           </w:tcPr>
           <w:p>
             <w:pPr>
@@ -6170,6 +6118,7 @@
         <w:tc>
           <w:tcPr>
             <w:tcW w:w="3134" w:type="dxa"/>
+            <w:gridSpan w:val="7"/>
           </w:tcPr>
           <w:p>
             <w:pPr>
@@ -6362,11 +6311,14 @@
       </w:tr>
       <w:tr>
         <w:trPr>
+          <w:gridAfter w:val="1"/>
+          <w:wAfter w:w="6" w:type="dxa"/>
           <w:trHeight w:val="1041"/>
         </w:trPr>
         <w:tc>
           <w:tcPr>
             <w:tcW w:w="3080" w:type="dxa"/>
+            <w:gridSpan w:val="4"/>
           </w:tcPr>
           <w:p>
             <w:pPr>
@@ -6397,6 +6349,7 @@
         <w:tc>
           <w:tcPr>
             <w:tcW w:w="809" w:type="dxa"/>
+            <w:gridSpan w:val="4"/>
             <w:vAlign w:val="center"/>
           </w:tcPr>
           <w:p>
@@ -6436,6 +6389,7 @@
         <w:tc>
           <w:tcPr>
             <w:tcW w:w="851" w:type="dxa"/>
+            <w:gridSpan w:val="2"/>
             <w:vAlign w:val="center"/>
           </w:tcPr>
           <w:p>
@@ -6500,6 +6454,7 @@
         <w:tc>
           <w:tcPr>
             <w:tcW w:w="3134" w:type="dxa"/>
+            <w:gridSpan w:val="7"/>
           </w:tcPr>
           <w:p>
             <w:pPr>
@@ -6621,11 +6576,14 @@
       </w:tr>
       <w:tr>
         <w:trPr>
+          <w:gridAfter w:val="1"/>
+          <w:wAfter w:w="6" w:type="dxa"/>
           <w:trHeight w:val="489"/>
         </w:trPr>
         <w:tc>
           <w:tcPr>
             <w:tcW w:w="3080" w:type="dxa"/>
+            <w:gridSpan w:val="4"/>
           </w:tcPr>
           <w:p>
             <w:pPr>
@@ -6661,6 +6619,7 @@
         <w:tc>
           <w:tcPr>
             <w:tcW w:w="809" w:type="dxa"/>
+            <w:gridSpan w:val="4"/>
             <w:vAlign w:val="center"/>
           </w:tcPr>
           <w:p>
@@ -6700,6 +6659,7 @@
         <w:tc>
           <w:tcPr>
             <w:tcW w:w="851" w:type="dxa"/>
+            <w:gridSpan w:val="2"/>
             <w:vAlign w:val="center"/>
           </w:tcPr>
           <w:p>
@@ -6764,6 +6724,7 @@
         <w:tc>
           <w:tcPr>
             <w:tcW w:w="3134" w:type="dxa"/>
+            <w:gridSpan w:val="7"/>
           </w:tcPr>
           <w:p>
             <w:pPr>
@@ -6967,11 +6928,14 @@
       </w:tr>
       <w:tr>
         <w:trPr>
+          <w:gridAfter w:val="1"/>
+          <w:wAfter w:w="6" w:type="dxa"/>
           <w:trHeight w:val="359"/>
         </w:trPr>
         <w:tc>
           <w:tcPr>
             <w:tcW w:w="3080" w:type="dxa"/>
+            <w:gridSpan w:val="4"/>
           </w:tcPr>
           <w:p>
             <w:pPr>
@@ -6994,6 +6958,7 @@
         <w:tc>
           <w:tcPr>
             <w:tcW w:w="809" w:type="dxa"/>
+            <w:gridSpan w:val="4"/>
             <w:vAlign w:val="center"/>
           </w:tcPr>
           <w:p>
@@ -7033,6 +6998,7 @@
         <w:tc>
           <w:tcPr>
             <w:tcW w:w="851" w:type="dxa"/>
+            <w:gridSpan w:val="2"/>
             <w:vAlign w:val="center"/>
           </w:tcPr>
           <w:p>
@@ -7097,6 +7063,7 @@
         <w:tc>
           <w:tcPr>
             <w:tcW w:w="3134" w:type="dxa"/>
+            <w:gridSpan w:val="7"/>
           </w:tcPr>
           <w:p>
             <w:pPr>
@@ -7244,11 +7211,14 @@
       </w:tr>
       <w:tr>
         <w:trPr>
+          <w:gridAfter w:val="1"/>
+          <w:wAfter w:w="6" w:type="dxa"/>
           <w:trHeight w:val="481"/>
         </w:trPr>
         <w:tc>
           <w:tcPr>
             <w:tcW w:w="3080" w:type="dxa"/>
+            <w:gridSpan w:val="4"/>
           </w:tcPr>
           <w:p>
             <w:pPr>
@@ -7284,6 +7254,7 @@
         <w:tc>
           <w:tcPr>
             <w:tcW w:w="809" w:type="dxa"/>
+            <w:gridSpan w:val="4"/>
             <w:vAlign w:val="center"/>
           </w:tcPr>
           <w:p>
@@ -7323,6 +7294,7 @@
         <w:tc>
           <w:tcPr>
             <w:tcW w:w="851" w:type="dxa"/>
+            <w:gridSpan w:val="2"/>
             <w:vAlign w:val="center"/>
           </w:tcPr>
           <w:p>
@@ -7387,6 +7359,7 @@
         <w:tc>
           <w:tcPr>
             <w:tcW w:w="3134" w:type="dxa"/>
+            <w:gridSpan w:val="7"/>
           </w:tcPr>
           <w:p>
             <w:pPr>
@@ -7494,11 +7467,14 @@
       </w:tr>
       <w:tr>
         <w:trPr>
+          <w:gridAfter w:val="1"/>
+          <w:wAfter w:w="6" w:type="dxa"/>
           <w:trHeight w:val="479"/>
         </w:trPr>
         <w:tc>
           <w:tcPr>
             <w:tcW w:w="3080" w:type="dxa"/>
+            <w:gridSpan w:val="4"/>
           </w:tcPr>
           <w:p>
             <w:pPr>
@@ -7535,6 +7511,7 @@
         <w:tc>
           <w:tcPr>
             <w:tcW w:w="809" w:type="dxa"/>
+            <w:gridSpan w:val="4"/>
             <w:vAlign w:val="center"/>
           </w:tcPr>
           <w:p>
@@ -7574,6 +7551,7 @@
         <w:tc>
           <w:tcPr>
             <w:tcW w:w="851" w:type="dxa"/>
+            <w:gridSpan w:val="2"/>
             <w:vAlign w:val="center"/>
           </w:tcPr>
           <w:p>
@@ -7638,6 +7616,7 @@
         <w:tc>
           <w:tcPr>
             <w:tcW w:w="3134" w:type="dxa"/>
+            <w:gridSpan w:val="7"/>
           </w:tcPr>
           <w:p>
             <w:pPr>
@@ -7746,11 +7725,14 @@
       </w:tr>
       <w:tr>
         <w:trPr>
+          <w:gridAfter w:val="1"/>
+          <w:wAfter w:w="6" w:type="dxa"/>
           <w:trHeight w:val="597"/>
         </w:trPr>
         <w:tc>
           <w:tcPr>
             <w:tcW w:w="3080" w:type="dxa"/>
+            <w:gridSpan w:val="4"/>
           </w:tcPr>
           <w:p>
             <w:pPr>
@@ -7799,6 +7781,7 @@
         <w:tc>
           <w:tcPr>
             <w:tcW w:w="809" w:type="dxa"/>
+            <w:gridSpan w:val="4"/>
             <w:vAlign w:val="center"/>
           </w:tcPr>
           <w:p>
@@ -7838,6 +7821,7 @@
         <w:tc>
           <w:tcPr>
             <w:tcW w:w="851" w:type="dxa"/>
+            <w:gridSpan w:val="2"/>
             <w:vAlign w:val="center"/>
           </w:tcPr>
           <w:p>
@@ -7902,6 +7886,7 @@
         <w:tc>
           <w:tcPr>
             <w:tcW w:w="3134" w:type="dxa"/>
+            <w:gridSpan w:val="7"/>
           </w:tcPr>
           <w:p>
             <w:pPr>
@@ -8011,7 +7996,13 @@
               <w:rPr>
                 <w:sz w:val="20"/>
               </w:rPr>
-              <w:t>diab_ins</w:t>
+              <w:t>diab_</w:t>
+            </w:r>
+            <w:r>
+              <w:rPr>
+                <w:sz w:val="20"/>
+              </w:rPr>
+              <w:t>non</w:t>
             </w:r>
             <w:proofErr w:type="spellEnd"/>
             <w:r>
@@ -8151,11 +8142,14 @@
       </w:tr>
       <w:tr>
         <w:trPr>
+          <w:gridAfter w:val="1"/>
+          <w:wAfter w:w="6" w:type="dxa"/>
           <w:trHeight w:val="359"/>
         </w:trPr>
         <w:tc>
           <w:tcPr>
             <w:tcW w:w="3080" w:type="dxa"/>
+            <w:gridSpan w:val="4"/>
           </w:tcPr>
           <w:p>
             <w:pPr>
@@ -8178,6 +8172,7 @@
         <w:tc>
           <w:tcPr>
             <w:tcW w:w="809" w:type="dxa"/>
+            <w:gridSpan w:val="4"/>
             <w:vAlign w:val="center"/>
           </w:tcPr>
           <w:p>
@@ -8217,6 +8212,7 @@
         <w:tc>
           <w:tcPr>
             <w:tcW w:w="851" w:type="dxa"/>
+            <w:gridSpan w:val="2"/>
             <w:vAlign w:val="center"/>
           </w:tcPr>
           <w:p>
@@ -8281,6 +8277,7 @@
         <w:tc>
           <w:tcPr>
             <w:tcW w:w="3134" w:type="dxa"/>
+            <w:gridSpan w:val="7"/>
           </w:tcPr>
           <w:p>
             <w:pPr>
@@ -8401,11 +8398,14 @@
       </w:tr>
       <w:tr>
         <w:trPr>
+          <w:gridAfter w:val="1"/>
+          <w:wAfter w:w="6" w:type="dxa"/>
           <w:trHeight w:val="359"/>
         </w:trPr>
         <w:tc>
           <w:tcPr>
             <w:tcW w:w="3080" w:type="dxa"/>
+            <w:gridSpan w:val="4"/>
           </w:tcPr>
           <w:p>
             <w:pPr>
@@ -8441,6 +8441,7 @@
         <w:tc>
           <w:tcPr>
             <w:tcW w:w="809" w:type="dxa"/>
+            <w:gridSpan w:val="4"/>
             <w:vAlign w:val="center"/>
           </w:tcPr>
           <w:p>
@@ -8480,6 +8481,7 @@
         <w:tc>
           <w:tcPr>
             <w:tcW w:w="851" w:type="dxa"/>
+            <w:gridSpan w:val="2"/>
             <w:vAlign w:val="center"/>
           </w:tcPr>
           <w:p>
@@ -8544,6 +8546,7 @@
         <w:tc>
           <w:tcPr>
             <w:tcW w:w="3134" w:type="dxa"/>
+            <w:gridSpan w:val="7"/>
           </w:tcPr>
           <w:p>
             <w:pPr>
@@ -8651,11 +8654,14 @@
       </w:tr>
       <w:tr>
         <w:trPr>
+          <w:gridAfter w:val="1"/>
+          <w:wAfter w:w="6" w:type="dxa"/>
           <w:trHeight w:val="359"/>
         </w:trPr>
         <w:tc>
           <w:tcPr>
             <w:tcW w:w="3080" w:type="dxa"/>
+            <w:gridSpan w:val="4"/>
           </w:tcPr>
           <w:p>
             <w:pPr>
@@ -8691,6 +8697,7 @@
         <w:tc>
           <w:tcPr>
             <w:tcW w:w="809" w:type="dxa"/>
+            <w:gridSpan w:val="4"/>
             <w:vAlign w:val="center"/>
           </w:tcPr>
           <w:p>
@@ -8730,6 +8737,7 @@
         <w:tc>
           <w:tcPr>
             <w:tcW w:w="851" w:type="dxa"/>
+            <w:gridSpan w:val="2"/>
             <w:vAlign w:val="center"/>
           </w:tcPr>
           <w:p>
@@ -8794,6 +8802,7 @@
         <w:tc>
           <w:tcPr>
             <w:tcW w:w="3134" w:type="dxa"/>
+            <w:gridSpan w:val="7"/>
           </w:tcPr>
           <w:p>
             <w:pPr>
@@ -8901,11 +8910,14 @@
       </w:tr>
       <w:tr>
         <w:trPr>
+          <w:gridAfter w:val="1"/>
+          <w:wAfter w:w="6" w:type="dxa"/>
           <w:trHeight w:val="362"/>
         </w:trPr>
         <w:tc>
           <w:tcPr>
             <w:tcW w:w="3080" w:type="dxa"/>
+            <w:gridSpan w:val="4"/>
           </w:tcPr>
           <w:p>
             <w:pPr>
@@ -8954,6 +8966,7 @@
         <w:tc>
           <w:tcPr>
             <w:tcW w:w="809" w:type="dxa"/>
+            <w:gridSpan w:val="4"/>
             <w:vAlign w:val="center"/>
           </w:tcPr>
           <w:p>
@@ -8993,6 +9006,7 @@
         <w:tc>
           <w:tcPr>
             <w:tcW w:w="851" w:type="dxa"/>
+            <w:gridSpan w:val="2"/>
             <w:vAlign w:val="center"/>
           </w:tcPr>
           <w:p>
@@ -9057,6 +9071,7 @@
         <w:tc>
           <w:tcPr>
             <w:tcW w:w="3134" w:type="dxa"/>
+            <w:gridSpan w:val="7"/>
           </w:tcPr>
           <w:p>
             <w:pPr>
@@ -9177,11 +9192,14 @@
       </w:tr>
       <w:tr>
         <w:trPr>
+          <w:gridAfter w:val="1"/>
+          <w:wAfter w:w="6" w:type="dxa"/>
           <w:trHeight w:val="486"/>
         </w:trPr>
         <w:tc>
           <w:tcPr>
             <w:tcW w:w="3080" w:type="dxa"/>
+            <w:gridSpan w:val="4"/>
           </w:tcPr>
           <w:p>
             <w:pPr>
@@ -9204,6 +9222,7 @@
         <w:tc>
           <w:tcPr>
             <w:tcW w:w="809" w:type="dxa"/>
+            <w:gridSpan w:val="4"/>
             <w:vAlign w:val="center"/>
           </w:tcPr>
           <w:p>
@@ -9243,6 +9262,7 @@
         <w:tc>
           <w:tcPr>
             <w:tcW w:w="851" w:type="dxa"/>
+            <w:gridSpan w:val="2"/>
             <w:vAlign w:val="center"/>
           </w:tcPr>
           <w:p>
@@ -9307,6 +9327,7 @@
         <w:tc>
           <w:tcPr>
             <w:tcW w:w="3134" w:type="dxa"/>
+            <w:gridSpan w:val="7"/>
           </w:tcPr>
           <w:p>
             <w:pPr>
@@ -9470,11 +9491,14 @@
       </w:tr>
       <w:tr>
         <w:trPr>
+          <w:gridAfter w:val="1"/>
+          <w:wAfter w:w="6" w:type="dxa"/>
           <w:trHeight w:val="489"/>
         </w:trPr>
         <w:tc>
           <w:tcPr>
             <w:tcW w:w="3080" w:type="dxa"/>
+            <w:gridSpan w:val="4"/>
           </w:tcPr>
           <w:p>
             <w:pPr>
@@ -9497,6 +9521,7 @@
         <w:tc>
           <w:tcPr>
             <w:tcW w:w="809" w:type="dxa"/>
+            <w:gridSpan w:val="4"/>
             <w:vAlign w:val="center"/>
           </w:tcPr>
           <w:p>
@@ -9536,6 +9561,7 @@
         <w:tc>
           <w:tcPr>
             <w:tcW w:w="851" w:type="dxa"/>
+            <w:gridSpan w:val="2"/>
             <w:vAlign w:val="center"/>
           </w:tcPr>
           <w:p>
@@ -9600,6 +9626,7 @@
         <w:tc>
           <w:tcPr>
             <w:tcW w:w="3134" w:type="dxa"/>
+            <w:gridSpan w:val="7"/>
           </w:tcPr>
           <w:p>
             <w:pPr>
@@ -9847,11 +9874,14 @@
       </w:tr>
       <w:tr>
         <w:trPr>
+          <w:gridAfter w:val="1"/>
+          <w:wAfter w:w="6" w:type="dxa"/>
           <w:trHeight w:val="731"/>
         </w:trPr>
         <w:tc>
           <w:tcPr>
             <w:tcW w:w="3080" w:type="dxa"/>
+            <w:gridSpan w:val="4"/>
           </w:tcPr>
           <w:p>
             <w:pPr>
@@ -9874,6 +9904,7 @@
         <w:tc>
           <w:tcPr>
             <w:tcW w:w="809" w:type="dxa"/>
+            <w:gridSpan w:val="4"/>
             <w:vAlign w:val="center"/>
           </w:tcPr>
           <w:p>
@@ -9913,6 +9944,7 @@
         <w:tc>
           <w:tcPr>
             <w:tcW w:w="851" w:type="dxa"/>
+            <w:gridSpan w:val="2"/>
             <w:vAlign w:val="center"/>
           </w:tcPr>
           <w:p>
@@ -9977,6 +10009,7 @@
         <w:tc>
           <w:tcPr>
             <w:tcW w:w="3134" w:type="dxa"/>
+            <w:gridSpan w:val="7"/>
           </w:tcPr>
           <w:p>
             <w:pPr>
@@ -10178,11 +10211,14 @@
       </w:tr>
       <w:tr>
         <w:trPr>
+          <w:gridAfter w:val="1"/>
+          <w:wAfter w:w="6" w:type="dxa"/>
           <w:trHeight w:val="734"/>
         </w:trPr>
         <w:tc>
           <w:tcPr>
             <w:tcW w:w="3080" w:type="dxa"/>
+            <w:gridSpan w:val="4"/>
           </w:tcPr>
           <w:p>
             <w:pPr>
@@ -10219,6 +10255,7 @@
         <w:tc>
           <w:tcPr>
             <w:tcW w:w="809" w:type="dxa"/>
+            <w:gridSpan w:val="4"/>
             <w:vAlign w:val="center"/>
           </w:tcPr>
           <w:p>
@@ -10258,6 +10295,7 @@
         <w:tc>
           <w:tcPr>
             <w:tcW w:w="851" w:type="dxa"/>
+            <w:gridSpan w:val="2"/>
             <w:vAlign w:val="center"/>
           </w:tcPr>
           <w:p>
@@ -10322,6 +10360,7 @@
         <w:tc>
           <w:tcPr>
             <w:tcW w:w="3134" w:type="dxa"/>
+            <w:gridSpan w:val="7"/>
           </w:tcPr>
           <w:p>
             <w:pPr>
@@ -10484,11 +10523,14 @@
       </w:tr>
       <w:tr>
         <w:trPr>
+          <w:gridAfter w:val="1"/>
+          <w:wAfter w:w="6" w:type="dxa"/>
           <w:trHeight w:val="561"/>
         </w:trPr>
         <w:tc>
           <w:tcPr>
             <w:tcW w:w="3080" w:type="dxa"/>
+            <w:gridSpan w:val="4"/>
           </w:tcPr>
           <w:p>
             <w:pPr>
@@ -10554,6 +10596,7 @@
         <w:tc>
           <w:tcPr>
             <w:tcW w:w="809" w:type="dxa"/>
+            <w:gridSpan w:val="4"/>
             <w:vAlign w:val="center"/>
           </w:tcPr>
           <w:p>
@@ -10593,6 +10636,7 @@
         <w:tc>
           <w:tcPr>
             <w:tcW w:w="851" w:type="dxa"/>
+            <w:gridSpan w:val="2"/>
             <w:vAlign w:val="center"/>
           </w:tcPr>
           <w:p>
@@ -10657,6 +10701,7 @@
         <w:tc>
           <w:tcPr>
             <w:tcW w:w="3134" w:type="dxa"/>
+            <w:gridSpan w:val="7"/>
           </w:tcPr>
           <w:p>
             <w:pPr>
@@ -10815,11 +10860,14 @@
       </w:tr>
       <w:tr>
         <w:trPr>
+          <w:gridAfter w:val="1"/>
+          <w:wAfter w:w="6" w:type="dxa"/>
           <w:trHeight w:val="486"/>
         </w:trPr>
         <w:tc>
           <w:tcPr>
             <w:tcW w:w="3080" w:type="dxa"/>
+            <w:gridSpan w:val="4"/>
           </w:tcPr>
           <w:p>
             <w:pPr>
@@ -10874,6 +10922,7 @@
         <w:tc>
           <w:tcPr>
             <w:tcW w:w="809" w:type="dxa"/>
+            <w:gridSpan w:val="4"/>
             <w:vAlign w:val="center"/>
           </w:tcPr>
           <w:p>
@@ -10913,6 +10962,7 @@
         <w:tc>
           <w:tcPr>
             <w:tcW w:w="851" w:type="dxa"/>
+            <w:gridSpan w:val="2"/>
             <w:vAlign w:val="center"/>
           </w:tcPr>
           <w:p>
@@ -10977,6 +11027,7 @@
         <w:tc>
           <w:tcPr>
             <w:tcW w:w="3134" w:type="dxa"/>
+            <w:gridSpan w:val="7"/>
           </w:tcPr>
           <w:p>
             <w:pPr>
@@ -11205,11 +11256,14 @@
       </w:tr>
       <w:tr>
         <w:trPr>
+          <w:gridAfter w:val="1"/>
+          <w:wAfter w:w="6" w:type="dxa"/>
           <w:trHeight w:val="489"/>
         </w:trPr>
         <w:tc>
           <w:tcPr>
             <w:tcW w:w="3080" w:type="dxa"/>
+            <w:gridSpan w:val="4"/>
           </w:tcPr>
           <w:p>
             <w:pPr>
@@ -11258,6 +11312,7 @@
         <w:tc>
           <w:tcPr>
             <w:tcW w:w="809" w:type="dxa"/>
+            <w:gridSpan w:val="4"/>
             <w:vAlign w:val="center"/>
           </w:tcPr>
           <w:p>
@@ -11297,6 +11352,7 @@
         <w:tc>
           <w:tcPr>
             <w:tcW w:w="851" w:type="dxa"/>
+            <w:gridSpan w:val="2"/>
             <w:vAlign w:val="center"/>
           </w:tcPr>
           <w:p>
@@ -11361,6 +11417,7 @@
         <w:tc>
           <w:tcPr>
             <w:tcW w:w="3134" w:type="dxa"/>
+            <w:gridSpan w:val="7"/>
           </w:tcPr>
           <w:p>
             <w:pPr>
@@ -11602,11 +11659,14 @@
       </w:tr>
       <w:tr>
         <w:trPr>
+          <w:gridAfter w:val="1"/>
+          <w:wAfter w:w="6" w:type="dxa"/>
           <w:trHeight w:val="489"/>
         </w:trPr>
         <w:tc>
           <w:tcPr>
             <w:tcW w:w="3080" w:type="dxa"/>
+            <w:gridSpan w:val="4"/>
           </w:tcPr>
           <w:p>
             <w:pPr>
@@ -11629,6 +11689,7 @@
         <w:tc>
           <w:tcPr>
             <w:tcW w:w="809" w:type="dxa"/>
+            <w:gridSpan w:val="4"/>
             <w:vAlign w:val="center"/>
           </w:tcPr>
           <w:p>
@@ -11668,6 +11729,7 @@
         <w:tc>
           <w:tcPr>
             <w:tcW w:w="851" w:type="dxa"/>
+            <w:gridSpan w:val="2"/>
             <w:vAlign w:val="center"/>
           </w:tcPr>
           <w:p>
@@ -11732,6 +11794,7 @@
         <w:tc>
           <w:tcPr>
             <w:tcW w:w="3134" w:type="dxa"/>
+            <w:gridSpan w:val="7"/>
           </w:tcPr>
           <w:p>
             <w:pPr>
@@ -11960,11 +12023,14 @@
       </w:tr>
       <w:tr>
         <w:trPr>
+          <w:gridAfter w:val="1"/>
+          <w:wAfter w:w="6" w:type="dxa"/>
           <w:trHeight w:val="359"/>
         </w:trPr>
         <w:tc>
           <w:tcPr>
             <w:tcW w:w="3080" w:type="dxa"/>
+            <w:gridSpan w:val="4"/>
           </w:tcPr>
           <w:p>
             <w:pPr>
@@ -11987,6 +12053,7 @@
         <w:tc>
           <w:tcPr>
             <w:tcW w:w="809" w:type="dxa"/>
+            <w:gridSpan w:val="4"/>
             <w:vAlign w:val="center"/>
           </w:tcPr>
           <w:p>
@@ -12026,6 +12093,7 @@
         <w:tc>
           <w:tcPr>
             <w:tcW w:w="851" w:type="dxa"/>
+            <w:gridSpan w:val="2"/>
             <w:vAlign w:val="center"/>
           </w:tcPr>
           <w:p>
@@ -12090,6 +12158,7 @@
         <w:tc>
           <w:tcPr>
             <w:tcW w:w="3134" w:type="dxa"/>
+            <w:gridSpan w:val="7"/>
           </w:tcPr>
           <w:p>
             <w:pPr>
@@ -12223,12 +12292,14 @@
       </w:tr>
       <w:tr>
         <w:trPr>
+          <w:gridAfter w:val="1"/>
+          <w:wAfter w:w="6" w:type="dxa"/>
           <w:trHeight w:val="350"/>
         </w:trPr>
         <w:tc>
           <w:tcPr>
             <w:tcW w:w="9565" w:type="dxa"/>
-            <w:gridSpan w:val="7"/>
+            <w:gridSpan w:val="20"/>
             <w:shd w:val="clear" w:color="auto" w:fill="D9D9D9"/>
           </w:tcPr>
           <w:p>
@@ -12254,11 +12325,14 @@
       </w:tr>
       <w:tr>
         <w:trPr>
+          <w:gridAfter w:val="1"/>
+          <w:wAfter w:w="6" w:type="dxa"/>
           <w:trHeight w:val="359"/>
         </w:trPr>
         <w:tc>
           <w:tcPr>
             <w:tcW w:w="3080" w:type="dxa"/>
+            <w:gridSpan w:val="4"/>
           </w:tcPr>
           <w:p>
             <w:pPr>
@@ -12273,6 +12347,7 @@
               <w:rPr>
                 <w:sz w:val="20"/>
               </w:rPr>
+              <w:lastRenderedPageBreak/>
               <w:t>Date</w:t>
             </w:r>
             <w:r>
@@ -12320,7 +12395,7 @@
         <w:tc>
           <w:tcPr>
             <w:tcW w:w="1981" w:type="dxa"/>
-            <w:gridSpan w:val="3"/>
+            <w:gridSpan w:val="7"/>
             <w:vAlign w:val="center"/>
           </w:tcPr>
           <w:p>
@@ -12360,7 +12435,7 @@
         <w:tc>
           <w:tcPr>
             <w:tcW w:w="4504" w:type="dxa"/>
-            <w:gridSpan w:val="3"/>
+            <w:gridSpan w:val="9"/>
           </w:tcPr>
           <w:p>
             <w:pPr>
@@ -12523,11 +12598,14 @@
       </w:tr>
       <w:tr>
         <w:trPr>
+          <w:gridAfter w:val="1"/>
+          <w:wAfter w:w="6" w:type="dxa"/>
           <w:trHeight w:val="504"/>
         </w:trPr>
         <w:tc>
           <w:tcPr>
             <w:tcW w:w="3080" w:type="dxa"/>
+            <w:gridSpan w:val="4"/>
           </w:tcPr>
           <w:p>
             <w:pPr>
@@ -12689,7 +12767,7 @@
         <w:tc>
           <w:tcPr>
             <w:tcW w:w="1981" w:type="dxa"/>
-            <w:gridSpan w:val="3"/>
+            <w:gridSpan w:val="7"/>
           </w:tcPr>
           <w:p>
             <w:pPr>
@@ -12847,7 +12925,7 @@
         <w:tc>
           <w:tcPr>
             <w:tcW w:w="4504" w:type="dxa"/>
-            <w:gridSpan w:val="3"/>
+            <w:gridSpan w:val="9"/>
           </w:tcPr>
           <w:p>
             <w:pPr>
@@ -13013,11 +13091,14 @@
       </w:tr>
       <w:tr>
         <w:trPr>
+          <w:gridAfter w:val="1"/>
+          <w:wAfter w:w="6" w:type="dxa"/>
           <w:trHeight w:val="359"/>
         </w:trPr>
         <w:tc>
           <w:tcPr>
             <w:tcW w:w="3080" w:type="dxa"/>
+            <w:gridSpan w:val="4"/>
           </w:tcPr>
           <w:p>
             <w:pPr>
@@ -13075,7 +13156,7 @@
         <w:tc>
           <w:tcPr>
             <w:tcW w:w="1981" w:type="dxa"/>
-            <w:gridSpan w:val="3"/>
+            <w:gridSpan w:val="7"/>
             <w:vAlign w:val="center"/>
           </w:tcPr>
           <w:p>
@@ -13115,7 +13196,7 @@
         <w:tc>
           <w:tcPr>
             <w:tcW w:w="4504" w:type="dxa"/>
-            <w:gridSpan w:val="3"/>
+            <w:gridSpan w:val="9"/>
           </w:tcPr>
           <w:p>
             <w:pPr>
@@ -13207,12 +13288,14 @@
       </w:tr>
       <w:tr>
         <w:trPr>
+          <w:gridAfter w:val="1"/>
+          <w:wAfter w:w="6" w:type="dxa"/>
           <w:trHeight w:val="1122"/>
         </w:trPr>
         <w:tc>
           <w:tcPr>
             <w:tcW w:w="9565" w:type="dxa"/>
-            <w:gridSpan w:val="7"/>
+            <w:gridSpan w:val="20"/>
           </w:tcPr>
           <w:p>
             <w:pPr>
@@ -13228,7 +13311,6 @@
                 <w:b/>
                 <w:sz w:val="20"/>
               </w:rPr>
-              <w:lastRenderedPageBreak/>
               <w:t>DISCLAIMER</w:t>
             </w:r>
             <w:r>
@@ -13591,12 +13673,14 @@
       </w:tr>
       <w:tr>
         <w:trPr>
+          <w:gridAfter w:val="1"/>
+          <w:wAfter w:w="6" w:type="dxa"/>
           <w:trHeight w:val="441"/>
         </w:trPr>
         <w:tc>
           <w:tcPr>
             <w:tcW w:w="4740" w:type="dxa"/>
-            <w:gridSpan w:val="3"/>
+            <w:gridSpan w:val="10"/>
           </w:tcPr>
           <w:p>
             <w:pPr>
@@ -13637,7 +13721,7 @@
         <w:tc>
           <w:tcPr>
             <w:tcW w:w="4825" w:type="dxa"/>
-            <w:gridSpan w:val="4"/>
+            <w:gridSpan w:val="10"/>
           </w:tcPr>
           <w:p>
             <w:pPr>
@@ -13751,6 +13835,7 @@
           <w:sz w:val="18"/>
         </w:rPr>
         <w:sectPr>
+          <w:footerReference w:type="default" r:id="rId9"/>
           <w:pgSz w:w="11910" w:h="16840"/>
           <w:pgMar w:top="1400" w:right="992" w:bottom="280" w:left="1133" w:header="720" w:footer="720" w:gutter="0"/>
           <w:cols w:space="720"/>
@@ -14702,6 +14787,12 @@
                 <w:spacing w:val="-2"/>
               </w:rPr>
               <w:t>:</w:t>
+            </w:r>
+            <w:r>
+              <w:rPr>
+                <w:spacing w:val="-2"/>
+              </w:rPr>
+              <w:t xml:space="preserve"> </w:t>
             </w:r>
           </w:p>
         </w:tc>

</xml_diff>